<commit_message>
CV final v2 - Curriculum Vitae, bac sans moyenne finale, (59) Lille/Université, Allemand certifié
</commit_message>
<xml_diff>
--- a/CV/CV_AIT_AMIR_Youssouf_final.docx
+++ b/CV/CV_AIT_AMIR_Youssouf_final.docx
@@ -17,6 +17,21 @@
           <w:szCs w:val="48"/>
         </w:rPr>
         <w:t xml:space="preserve">AIT AMIR Youssouf</w:t>
+      </w:r>
+    </w:p>
+    <w:p>
+      <w:pPr>
+        <w:spacing w:after="10" w:before="0"/>
+        <w:jc w:val="center"/>
+      </w:pPr>
+      <w:r>
+        <w:rPr>
+          <w:rFonts w:ascii="Calibri" w:cs="Calibri" w:eastAsia="Calibri" w:hAnsi="Calibri"/>
+          <w:color w:val="7F8C8D"/>
+          <w:sz w:val="26"/>
+          <w:szCs w:val="26"/>
+        </w:rPr>
+        <w:t xml:space="preserve">Curriculum Vitae</w:t>
       </w:r>
     </w:p>
     <w:p>
@@ -332,7 +347,7 @@
           <w:sz w:val="18"/>
           <w:szCs w:val="18"/>
         </w:rPr>
-        <w:t xml:space="preserve">Universite de Lille</w:t>
+        <w:t xml:space="preserve">Universite de Lille (59)</w:t>
       </w:r>
     </w:p>
     <w:p>
@@ -411,7 +426,7 @@
           <w:sz w:val="18"/>
           <w:szCs w:val="18"/>
         </w:rPr>
-        <w:t xml:space="preserve">Lycee Faidherbe, Lille</w:t>
+        <w:t xml:space="preserve">Lycee Faidherbe, Lille (59)</w:t>
       </w:r>
     </w:p>
     <w:p>
@@ -426,7 +441,7 @@
           <w:sz w:val="18"/>
           <w:szCs w:val="18"/>
         </w:rPr>
-        <w:t xml:space="preserve">▸  Admis — Moyenne finale : 11,38/20</w:t>
+        <w:t xml:space="preserve">▸  Admis — 11,38/20</w:t>
       </w:r>
     </w:p>
     <w:p>
@@ -737,7 +752,7 @@
           <w:sz w:val="18"/>
           <w:szCs w:val="18"/>
         </w:rPr>
-        <w:t xml:space="preserve">A2+</w:t>
+        <w:t xml:space="preserve">A2+ certifie</w:t>
       </w:r>
     </w:p>
     <w:p>

</xml_diff>

<commit_message>
CV final v3 - SQL/MySQL retiré de bureautique, Curriculum Vitae agrandi
</commit_message>
<xml_diff>
--- a/CV/CV_AIT_AMIR_Youssouf_final.docx
+++ b/CV/CV_AIT_AMIR_Youssouf_final.docx
@@ -28,8 +28,8 @@
         <w:rPr>
           <w:rFonts w:ascii="Calibri" w:cs="Calibri" w:eastAsia="Calibri" w:hAnsi="Calibri"/>
           <w:color w:val="7F8C8D"/>
-          <w:sz w:val="26"/>
-          <w:szCs w:val="26"/>
+          <w:sz w:val="34"/>
+          <w:szCs w:val="34"/>
         </w:rPr>
         <w:t xml:space="preserve">Curriculum Vitae</w:t>
       </w:r>
@@ -377,7 +377,7 @@
           <w:sz w:val="18"/>
           <w:szCs w:val="18"/>
         </w:rPr>
-        <w:t xml:space="preserve">▸  Bureautique : Microsoft Office (Word, Excel, PowerPoint, Access), SQL / MySQL</w:t>
+        <w:t xml:space="preserve">▸  Bureautique : Microsoft Office (Word, Excel, PowerPoint, Access)</w:t>
       </w:r>
     </w:p>
     <w:p>

</xml_diff>